<commit_message>
Add data visualization method section to Technical Report
</commit_message>
<xml_diff>
--- a/Submission/TechnicalReport_SpaceRover.docx
+++ b/Submission/TechnicalReport_SpaceRover.docx
@@ -78,12 +78,6 @@
         <w:gridCol w:w="7160"/>
       </w:tblGrid>
       <w:tr>
-        <w:tblPrEx>
-          <w:tblCellMar>
-            <w:top w:w="0" w:type="dxa"/>
-            <w:bottom w:w="0" w:type="dxa"/>
-          </w:tblCellMar>
-        </w:tblPrEx>
         <w:tc>
           <w:tcPr>
             <w:tcW w:w="2200" w:type="dxa"/>
@@ -170,12 +164,6 @@
         <w:gridCol w:w="7160"/>
       </w:tblGrid>
       <w:tr>
-        <w:tblPrEx>
-          <w:tblCellMar>
-            <w:top w:w="0" w:type="dxa"/>
-            <w:bottom w:w="0" w:type="dxa"/>
-          </w:tblCellMar>
-        </w:tblPrEx>
         <w:tc>
           <w:tcPr>
             <w:tcW w:w="2200" w:type="dxa"/>
@@ -262,12 +250,6 @@
         <w:gridCol w:w="7160"/>
       </w:tblGrid>
       <w:tr>
-        <w:tblPrEx>
-          <w:tblCellMar>
-            <w:top w:w="0" w:type="dxa"/>
-            <w:bottom w:w="0" w:type="dxa"/>
-          </w:tblCellMar>
-        </w:tblPrEx>
         <w:tc>
           <w:tcPr>
             <w:tcW w:w="2200" w:type="dxa"/>
@@ -354,12 +336,6 @@
         <w:gridCol w:w="7160"/>
       </w:tblGrid>
       <w:tr>
-        <w:tblPrEx>
-          <w:tblCellMar>
-            <w:top w:w="0" w:type="dxa"/>
-            <w:bottom w:w="0" w:type="dxa"/>
-          </w:tblCellMar>
-        </w:tblPrEx>
         <w:tc>
           <w:tcPr>
             <w:tcW w:w="2200" w:type="dxa"/>
@@ -446,12 +422,6 @@
         <w:gridCol w:w="7160"/>
       </w:tblGrid>
       <w:tr>
-        <w:tblPrEx>
-          <w:tblCellMar>
-            <w:top w:w="0" w:type="dxa"/>
-            <w:bottom w:w="0" w:type="dxa"/>
-          </w:tblCellMar>
-        </w:tblPrEx>
         <w:tc>
           <w:tcPr>
             <w:tcW w:w="2200" w:type="dxa"/>
@@ -551,12 +521,6 @@
         <w:gridCol w:w="7160"/>
       </w:tblGrid>
       <w:tr>
-        <w:tblPrEx>
-          <w:tblCellMar>
-            <w:top w:w="0" w:type="dxa"/>
-            <w:bottom w:w="0" w:type="dxa"/>
-          </w:tblCellMar>
-        </w:tblPrEx>
         <w:tc>
           <w:tcPr>
             <w:tcW w:w="2200" w:type="dxa"/>
@@ -643,12 +607,6 @@
         <w:gridCol w:w="7160"/>
       </w:tblGrid>
       <w:tr>
-        <w:tblPrEx>
-          <w:tblCellMar>
-            <w:top w:w="0" w:type="dxa"/>
-            <w:bottom w:w="0" w:type="dxa"/>
-          </w:tblCellMar>
-        </w:tblPrEx>
         <w:tc>
           <w:tcPr>
             <w:tcW w:w="2200" w:type="dxa"/>
@@ -815,7 +773,15 @@
         <w:spacing w:before="60" w:after="80"/>
       </w:pPr>
       <w:r>
-        <w:t>The assignment required implementing one of the studied communication protocols to emulate a sensor that sends data to an environment simulator. This project fulfills all requirements:</w:t>
+        <w:t xml:space="preserve">The assignment required implementing one of the </w:t>
+      </w:r>
+      <w:proofErr w:type="gramStart"/>
+      <w:r>
+        <w:t>studied communication protocols</w:t>
+      </w:r>
+      <w:proofErr w:type="gramEnd"/>
+      <w:r>
+        <w:t xml:space="preserve"> to emulate a sensor that sends data to an environment simulator. This project fulfills all requirements:</w:t>
       </w:r>
     </w:p>
     <w:p>
@@ -845,12 +811,6 @@
         <w:gridCol w:w="4560"/>
       </w:tblGrid>
       <w:tr>
-        <w:tblPrEx>
-          <w:tblCellMar>
-            <w:top w:w="0" w:type="dxa"/>
-            <w:bottom w:w="0" w:type="dxa"/>
-          </w:tblCellMar>
-        </w:tblPrEx>
         <w:tc>
           <w:tcPr>
             <w:tcW w:w="4800" w:type="dxa"/>
@@ -921,12 +881,6 @@
         </w:tc>
       </w:tr>
       <w:tr>
-        <w:tblPrEx>
-          <w:tblCellMar>
-            <w:top w:w="0" w:type="dxa"/>
-            <w:bottom w:w="0" w:type="dxa"/>
-          </w:tblCellMar>
-        </w:tblPrEx>
         <w:tc>
           <w:tcPr>
             <w:tcW w:w="4800" w:type="dxa"/>
@@ -983,12 +937,6 @@
         </w:tc>
       </w:tr>
       <w:tr>
-        <w:tblPrEx>
-          <w:tblCellMar>
-            <w:top w:w="0" w:type="dxa"/>
-            <w:bottom w:w="0" w:type="dxa"/>
-          </w:tblCellMar>
-        </w:tblPrEx>
         <w:tc>
           <w:tcPr>
             <w:tcW w:w="4800" w:type="dxa"/>
@@ -1054,12 +1002,6 @@
         </w:tc>
       </w:tr>
       <w:tr>
-        <w:tblPrEx>
-          <w:tblCellMar>
-            <w:top w:w="0" w:type="dxa"/>
-            <w:bottom w:w="0" w:type="dxa"/>
-          </w:tblCellMar>
-        </w:tblPrEx>
         <w:tc>
           <w:tcPr>
             <w:tcW w:w="4800" w:type="dxa"/>
@@ -1116,12 +1058,6 @@
         </w:tc>
       </w:tr>
       <w:tr>
-        <w:tblPrEx>
-          <w:tblCellMar>
-            <w:top w:w="0" w:type="dxa"/>
-            <w:bottom w:w="0" w:type="dxa"/>
-          </w:tblCellMar>
-        </w:tblPrEx>
         <w:tc>
           <w:tcPr>
             <w:tcW w:w="4800" w:type="dxa"/>
@@ -1203,12 +1139,6 @@
         </w:tc>
       </w:tr>
       <w:tr>
-        <w:tblPrEx>
-          <w:tblCellMar>
-            <w:top w:w="0" w:type="dxa"/>
-            <w:bottom w:w="0" w:type="dxa"/>
-          </w:tblCellMar>
-        </w:tblPrEx>
         <w:tc>
           <w:tcPr>
             <w:tcW w:w="4800" w:type="dxa"/>
@@ -1265,12 +1195,6 @@
         </w:tc>
       </w:tr>
       <w:tr>
-        <w:tblPrEx>
-          <w:tblCellMar>
-            <w:top w:w="0" w:type="dxa"/>
-            <w:bottom w:w="0" w:type="dxa"/>
-          </w:tblCellMar>
-        </w:tblPrEx>
         <w:tc>
           <w:tcPr>
             <w:tcW w:w="4800" w:type="dxa"/>
@@ -1366,8 +1290,13 @@
         </w:numPr>
         <w:spacing w:before="40" w:after="40"/>
       </w:pPr>
-      <w:r>
-        <w:t>Full-duplex: single persistent TCP connection handles bidirectional data</w:t>
+      <w:proofErr w:type="gramStart"/>
+      <w:r>
+        <w:t>Full-duplex</w:t>
+      </w:r>
+      <w:proofErr w:type="gramEnd"/>
+      <w:r>
+        <w:t>: single persistent TCP connection handles bidirectional data</w:t>
       </w:r>
     </w:p>
     <w:p>
@@ -1443,7 +1372,15 @@
         <w:spacing w:before="40" w:after="40"/>
       </w:pPr>
       <w:r>
-        <w:t>No broker required: unlike MQTT, no intermediate server is needed for point-to-point sensor-to-simulator communication</w:t>
+        <w:t xml:space="preserve">No broker </w:t>
+      </w:r>
+      <w:proofErr w:type="gramStart"/>
+      <w:r>
+        <w:t>required</w:t>
+      </w:r>
+      <w:proofErr w:type="gramEnd"/>
+      <w:r>
+        <w:t>: unlike MQTT, no intermediate server is needed for point-to-point sensor-to-simulator communication</w:t>
       </w:r>
     </w:p>
     <w:p>
@@ -1537,16 +1474,23 @@
         <w:spacing w:before="40" w:after="40"/>
       </w:pPr>
       <w:r>
-        <w:lastRenderedPageBreak/>
         <w:t xml:space="preserve">Temporal smoothing: a deque of 7 frames uses </w:t>
       </w:r>
       <w:proofErr w:type="spellStart"/>
       <w:r>
-        <w:t>Counter.most_common</w:t>
+        <w:t>Counter.most_</w:t>
+      </w:r>
+      <w:proofErr w:type="gramStart"/>
+      <w:r>
+        <w:t>common</w:t>
       </w:r>
       <w:proofErr w:type="spellEnd"/>
       <w:r>
-        <w:t>() to filter transient detection noise; Partial Gesture falls back to last stable gesture</w:t>
+        <w:t>(</w:t>
+      </w:r>
+      <w:proofErr w:type="gramEnd"/>
+      <w:r>
+        <w:t>) to filter transient detection noise; Partial Gesture falls back to last stable gesture</w:t>
       </w:r>
     </w:p>
     <w:p>
@@ -1559,6 +1503,7 @@
         <w:spacing w:before="40" w:after="40"/>
       </w:pPr>
       <w:r>
+        <w:lastRenderedPageBreak/>
         <w:t xml:space="preserve">Hand label assignment uses </w:t>
       </w:r>
       <w:proofErr w:type="spellStart"/>
@@ -1608,12 +1553,6 @@
         <w:gridCol w:w="2760"/>
       </w:tblGrid>
       <w:tr>
-        <w:tblPrEx>
-          <w:tblCellMar>
-            <w:top w:w="0" w:type="dxa"/>
-            <w:bottom w:w="0" w:type="dxa"/>
-          </w:tblCellMar>
-        </w:tblPrEx>
         <w:tc>
           <w:tcPr>
             <w:tcW w:w="2300" w:type="dxa"/>
@@ -1752,12 +1691,6 @@
         </w:tc>
       </w:tr>
       <w:tr>
-        <w:tblPrEx>
-          <w:tblCellMar>
-            <w:top w:w="0" w:type="dxa"/>
-            <w:bottom w:w="0" w:type="dxa"/>
-          </w:tblCellMar>
-        </w:tblPrEx>
         <w:tc>
           <w:tcPr>
             <w:tcW w:w="2300" w:type="dxa"/>
@@ -1868,12 +1801,6 @@
         </w:tc>
       </w:tr>
       <w:tr>
-        <w:tblPrEx>
-          <w:tblCellMar>
-            <w:top w:w="0" w:type="dxa"/>
-            <w:bottom w:w="0" w:type="dxa"/>
-          </w:tblCellMar>
-        </w:tblPrEx>
         <w:tc>
           <w:tcPr>
             <w:tcW w:w="2300" w:type="dxa"/>
@@ -1984,12 +1911,6 @@
         </w:tc>
       </w:tr>
       <w:tr>
-        <w:tblPrEx>
-          <w:tblCellMar>
-            <w:top w:w="0" w:type="dxa"/>
-            <w:bottom w:w="0" w:type="dxa"/>
-          </w:tblCellMar>
-        </w:tblPrEx>
         <w:tc>
           <w:tcPr>
             <w:tcW w:w="2300" w:type="dxa"/>
@@ -2100,12 +2021,6 @@
         </w:tc>
       </w:tr>
       <w:tr>
-        <w:tblPrEx>
-          <w:tblCellMar>
-            <w:top w:w="0" w:type="dxa"/>
-            <w:bottom w:w="0" w:type="dxa"/>
-          </w:tblCellMar>
-        </w:tblPrEx>
         <w:tc>
           <w:tcPr>
             <w:tcW w:w="2300" w:type="dxa"/>
@@ -2216,12 +2131,6 @@
         </w:tc>
       </w:tr>
       <w:tr>
-        <w:tblPrEx>
-          <w:tblCellMar>
-            <w:top w:w="0" w:type="dxa"/>
-            <w:bottom w:w="0" w:type="dxa"/>
-          </w:tblCellMar>
-        </w:tblPrEx>
         <w:tc>
           <w:tcPr>
             <w:tcW w:w="2300" w:type="dxa"/>
@@ -2332,12 +2241,6 @@
         </w:tc>
       </w:tr>
       <w:tr>
-        <w:tblPrEx>
-          <w:tblCellMar>
-            <w:top w:w="0" w:type="dxa"/>
-            <w:bottom w:w="0" w:type="dxa"/>
-          </w:tblCellMar>
-        </w:tblPrEx>
         <w:tc>
           <w:tcPr>
             <w:tcW w:w="2300" w:type="dxa"/>
@@ -2448,12 +2351,6 @@
         </w:tc>
       </w:tr>
       <w:tr>
-        <w:tblPrEx>
-          <w:tblCellMar>
-            <w:top w:w="0" w:type="dxa"/>
-            <w:bottom w:w="0" w:type="dxa"/>
-          </w:tblCellMar>
-        </w:tblPrEx>
         <w:tc>
           <w:tcPr>
             <w:tcW w:w="2300" w:type="dxa"/>
@@ -2658,10 +2555,12 @@
         <w:t xml:space="preserve">Victory / One Finger calls </w:t>
       </w:r>
       <w:proofErr w:type="spellStart"/>
+      <w:proofErr w:type="gramStart"/>
       <w:r>
         <w:t>rover.Rotate</w:t>
       </w:r>
       <w:proofErr w:type="spellEnd"/>
+      <w:proofErr w:type="gramEnd"/>
       <w:r>
         <w:t>(Vector3.up, ±</w:t>
       </w:r>
@@ -2691,8 +2590,13 @@
         </w:numPr>
         <w:spacing w:before="40" w:after="40"/>
       </w:pPr>
-      <w:r>
-        <w:t xml:space="preserve">Fist zeroes </w:t>
+      <w:proofErr w:type="gramStart"/>
+      <w:r>
+        <w:t>Fist</w:t>
+      </w:r>
+      <w:proofErr w:type="gramEnd"/>
+      <w:r>
+        <w:t xml:space="preserve"> zeroes </w:t>
       </w:r>
       <w:proofErr w:type="spellStart"/>
       <w:r>
@@ -3018,10 +2922,35 @@
     </w:p>
     <w:p>
       <w:pPr>
+        <w:spacing w:before="40" w:after="40"/>
+        <w:rPr>
+          <w:b/>
+          <w:bCs/>
+        </w:rPr>
+      </w:pPr>
+    </w:p>
+    <w:p>
+      <w:pPr>
+        <w:spacing w:before="40" w:after="40"/>
+      </w:pPr>
+      <w:r>
+        <w:rPr>
+          <w:b/>
+          <w:bCs/>
+          <w:color w:val="444444"/>
+          <w:sz w:val="24"/>
+          <w:szCs w:val="24"/>
+        </w:rPr>
+        <w:t>4.2 Data Visualization Method</w:t>
+      </w:r>
+      <w:r>
+        <w:br/>
+        <w:t>Sensor data received through WebSocket is visualized in Unity using a real-time HUD overlay. The interface displays rover speed, battery level, temperature, operational status, and movement direction. Particle systems (dust and drill effects) provide visual feedback during movement and tool activation. Status indicators change dynamically according to rover state, allowing users to monitor system behavior and verify that gesture commands are correctly transmitted and executed. The visualization updates continuously as new JSON messages arrive from the Python sensor layer.</w:t>
+      </w:r>
+    </w:p>
+    <w:p>
+      <w:pPr>
         <w:spacing w:before="120"/>
-        <w:rPr>
-          <w:lang w:val="fr-FR"/>
-        </w:rPr>
       </w:pPr>
     </w:p>
     <w:p>
@@ -3149,7 +3078,16 @@
         <w:sz w:val="18"/>
         <w:szCs w:val="18"/>
       </w:rPr>
-      <w:t>Space Rover Simulator — Hand Gesture Control via WebSocket</w:t>
+      <w:t xml:space="preserve">Space Rover Simulator — Hand Gesture Control via </w:t>
+    </w:r>
+    <w:proofErr w:type="gramStart"/>
+    <w:r>
+      <w:rPr>
+        <w:color w:val="666666"/>
+        <w:sz w:val="18"/>
+        <w:szCs w:val="18"/>
+      </w:rPr>
+      <w:t>WebSocket</w:t>
     </w:r>
     <w:r>
       <w:rPr>
@@ -3157,7 +3095,16 @@
         <w:sz w:val="18"/>
         <w:szCs w:val="18"/>
       </w:rPr>
-      <w:t xml:space="preserve">  |  AI4CI Final Project</w:t>
+      <w:t xml:space="preserve">  |</w:t>
+    </w:r>
+    <w:proofErr w:type="gramEnd"/>
+    <w:r>
+      <w:rPr>
+        <w:color w:val="999999"/>
+        <w:sz w:val="18"/>
+        <w:szCs w:val="18"/>
+      </w:rPr>
+      <w:t xml:space="preserve">  AI4CI Final Project</w:t>
     </w:r>
   </w:p>
 </w:hdr>
@@ -3805,7 +3752,6 @@
   <w:style w:type="character" w:default="1" w:styleId="DefaultParagraphFont">
     <w:name w:val="Default Paragraph Font"/>
     <w:uiPriority w:val="1"/>
-    <w:semiHidden/>
     <w:unhideWhenUsed/>
   </w:style>
   <w:style w:type="table" w:default="1" w:styleId="TableNormal">

</xml_diff>